<commit_message>
fixed minor units of measurement conflicts and general typos
</commit_message>
<xml_diff>
--- a/documents/SDG14_Project_Guidance.docx
+++ b/documents/SDG14_Project_Guidance.docx
@@ -65,12 +65,6 @@
         <w:gridCol w:w="4360"/>
       </w:tblGrid>
       <w:tr>
-        <w:tblPrEx>
-          <w:tblCellMar>
-            <w:top w:w="0" w:type="dxa"/>
-            <w:bottom w:w="0" w:type="dxa"/>
-          </w:tblCellMar>
-        </w:tblPrEx>
         <w:trPr>
           <w:cantSplit/>
           <w:tblHeader/>
@@ -173,12 +167,6 @@
         </w:tc>
       </w:tr>
       <w:tr>
-        <w:tblPrEx>
-          <w:tblCellMar>
-            <w:top w:w="0" w:type="dxa"/>
-            <w:bottom w:w="0" w:type="dxa"/>
-          </w:tblCellMar>
-        </w:tblPrEx>
         <w:trPr>
           <w:cantSplit/>
         </w:trPr>
@@ -271,12 +259,6 @@
         </w:tc>
       </w:tr>
       <w:tr>
-        <w:tblPrEx>
-          <w:tblCellMar>
-            <w:top w:w="0" w:type="dxa"/>
-            <w:bottom w:w="0" w:type="dxa"/>
-          </w:tblCellMar>
-        </w:tblPrEx>
         <w:trPr>
           <w:cantSplit/>
         </w:trPr>
@@ -376,12 +358,6 @@
         </w:tc>
       </w:tr>
       <w:tr>
-        <w:tblPrEx>
-          <w:tblCellMar>
-            <w:top w:w="0" w:type="dxa"/>
-            <w:bottom w:w="0" w:type="dxa"/>
-          </w:tblCellMar>
-        </w:tblPrEx>
         <w:trPr>
           <w:cantSplit/>
         </w:trPr>
@@ -474,12 +450,6 @@
         </w:tc>
       </w:tr>
       <w:tr>
-        <w:tblPrEx>
-          <w:tblCellMar>
-            <w:top w:w="0" w:type="dxa"/>
-            <w:bottom w:w="0" w:type="dxa"/>
-          </w:tblCellMar>
-        </w:tblPrEx>
         <w:trPr>
           <w:cantSplit/>
         </w:trPr>
@@ -579,12 +549,6 @@
         </w:tc>
       </w:tr>
       <w:tr>
-        <w:tblPrEx>
-          <w:tblCellMar>
-            <w:top w:w="0" w:type="dxa"/>
-            <w:bottom w:w="0" w:type="dxa"/>
-          </w:tblCellMar>
-        </w:tblPrEx>
         <w:trPr>
           <w:cantSplit/>
         </w:trPr>
@@ -698,12 +662,6 @@
         </w:tc>
       </w:tr>
       <w:tr>
-        <w:tblPrEx>
-          <w:tblCellMar>
-            <w:top w:w="0" w:type="dxa"/>
-            <w:bottom w:w="0" w:type="dxa"/>
-          </w:tblCellMar>
-        </w:tblPrEx>
         <w:trPr>
           <w:cantSplit/>
         </w:trPr>
@@ -812,12 +770,6 @@
         </w:tc>
       </w:tr>
       <w:tr>
-        <w:tblPrEx>
-          <w:tblCellMar>
-            <w:top w:w="0" w:type="dxa"/>
-            <w:bottom w:w="0" w:type="dxa"/>
-          </w:tblCellMar>
-        </w:tblPrEx>
         <w:trPr>
           <w:cantSplit/>
         </w:trPr>
@@ -910,12 +862,6 @@
         </w:tc>
       </w:tr>
       <w:tr>
-        <w:tblPrEx>
-          <w:tblCellMar>
-            <w:top w:w="0" w:type="dxa"/>
-            <w:bottom w:w="0" w:type="dxa"/>
-          </w:tblCellMar>
-        </w:tblPrEx>
         <w:trPr>
           <w:cantSplit/>
         </w:trPr>
@@ -1008,12 +954,6 @@
         </w:tc>
       </w:tr>
       <w:tr>
-        <w:tblPrEx>
-          <w:tblCellMar>
-            <w:top w:w="0" w:type="dxa"/>
-            <w:bottom w:w="0" w:type="dxa"/>
-          </w:tblCellMar>
-        </w:tblPrEx>
         <w:trPr>
           <w:cantSplit/>
         </w:trPr>
@@ -1113,12 +1053,6 @@
         </w:tc>
       </w:tr>
       <w:tr>
-        <w:tblPrEx>
-          <w:tblCellMar>
-            <w:top w:w="0" w:type="dxa"/>
-            <w:bottom w:w="0" w:type="dxa"/>
-          </w:tblCellMar>
-        </w:tblPrEx>
         <w:trPr>
           <w:cantSplit/>
         </w:trPr>
@@ -1316,12 +1250,6 @@
         <w:gridCol w:w="1760"/>
       </w:tblGrid>
       <w:tr>
-        <w:tblPrEx>
-          <w:tblCellMar>
-            <w:top w:w="0" w:type="dxa"/>
-            <w:bottom w:w="0" w:type="dxa"/>
-          </w:tblCellMar>
-        </w:tblPrEx>
         <w:trPr>
           <w:cantSplit/>
           <w:tblHeader/>
@@ -1424,12 +1352,6 @@
         </w:tc>
       </w:tr>
       <w:tr>
-        <w:tblPrEx>
-          <w:tblCellMar>
-            <w:top w:w="0" w:type="dxa"/>
-            <w:bottom w:w="0" w:type="dxa"/>
-          </w:tblCellMar>
-        </w:tblPrEx>
         <w:trPr>
           <w:cantSplit/>
         </w:trPr>
@@ -1522,12 +1444,6 @@
         </w:tc>
       </w:tr>
       <w:tr>
-        <w:tblPrEx>
-          <w:tblCellMar>
-            <w:top w:w="0" w:type="dxa"/>
-            <w:bottom w:w="0" w:type="dxa"/>
-          </w:tblCellMar>
-        </w:tblPrEx>
         <w:trPr>
           <w:cantSplit/>
         </w:trPr>
@@ -1620,12 +1536,6 @@
         </w:tc>
       </w:tr>
       <w:tr>
-        <w:tblPrEx>
-          <w:tblCellMar>
-            <w:top w:w="0" w:type="dxa"/>
-            <w:bottom w:w="0" w:type="dxa"/>
-          </w:tblCellMar>
-        </w:tblPrEx>
         <w:trPr>
           <w:cantSplit/>
         </w:trPr>
@@ -1718,12 +1628,6 @@
         </w:tc>
       </w:tr>
       <w:tr>
-        <w:tblPrEx>
-          <w:tblCellMar>
-            <w:top w:w="0" w:type="dxa"/>
-            <w:bottom w:w="0" w:type="dxa"/>
-          </w:tblCellMar>
-        </w:tblPrEx>
         <w:trPr>
           <w:cantSplit/>
         </w:trPr>
@@ -1828,10 +1732,7 @@
       </w:pPr>
       <w:r>
         <w:lastRenderedPageBreak/>
-        <w:t>4.</w:t>
-      </w:r>
-      <w:r>
-        <w:t xml:space="preserve"> Issues in the raw-data table and how the schema handles them</w:t>
+        <w:t>4. Issues in the raw-data table and how the schema handles them</w:t>
       </w:r>
     </w:p>
     <w:tbl>
@@ -1857,12 +1758,6 @@
         <w:gridCol w:w="3657"/>
       </w:tblGrid>
       <w:tr>
-        <w:tblPrEx>
-          <w:tblCellMar>
-            <w:top w:w="0" w:type="dxa"/>
-            <w:bottom w:w="0" w:type="dxa"/>
-          </w:tblCellMar>
-        </w:tblPrEx>
         <w:trPr>
           <w:cantSplit/>
           <w:tblHeader/>
@@ -1965,12 +1860,6 @@
         </w:tc>
       </w:tr>
       <w:tr>
-        <w:tblPrEx>
-          <w:tblCellMar>
-            <w:top w:w="0" w:type="dxa"/>
-            <w:bottom w:w="0" w:type="dxa"/>
-          </w:tblCellMar>
-        </w:tblPrEx>
         <w:trPr>
           <w:cantSplit/>
         </w:trPr>
@@ -2088,12 +1977,6 @@
         </w:tc>
       </w:tr>
       <w:tr>
-        <w:tblPrEx>
-          <w:tblCellMar>
-            <w:top w:w="0" w:type="dxa"/>
-            <w:bottom w:w="0" w:type="dxa"/>
-          </w:tblCellMar>
-        </w:tblPrEx>
         <w:trPr>
           <w:cantSplit/>
         </w:trPr>
@@ -2227,12 +2110,6 @@
         </w:tc>
       </w:tr>
       <w:tr>
-        <w:tblPrEx>
-          <w:tblCellMar>
-            <w:top w:w="0" w:type="dxa"/>
-            <w:bottom w:w="0" w:type="dxa"/>
-          </w:tblCellMar>
-        </w:tblPrEx>
         <w:trPr>
           <w:cantSplit/>
         </w:trPr>
@@ -2366,12 +2243,6 @@
         </w:tc>
       </w:tr>
       <w:tr>
-        <w:tblPrEx>
-          <w:tblCellMar>
-            <w:top w:w="0" w:type="dxa"/>
-            <w:bottom w:w="0" w:type="dxa"/>
-          </w:tblCellMar>
-        </w:tblPrEx>
         <w:trPr>
           <w:cantSplit/>
         </w:trPr>
@@ -2489,12 +2360,6 @@
         </w:tc>
       </w:tr>
       <w:tr>
-        <w:tblPrEx>
-          <w:tblCellMar>
-            <w:top w:w="0" w:type="dxa"/>
-            <w:bottom w:w="0" w:type="dxa"/>
-          </w:tblCellMar>
-        </w:tblPrEx>
         <w:trPr>
           <w:cantSplit/>
         </w:trPr>
@@ -2605,12 +2470,6 @@
         </w:tc>
       </w:tr>
       <w:tr>
-        <w:tblPrEx>
-          <w:tblCellMar>
-            <w:top w:w="0" w:type="dxa"/>
-            <w:bottom w:w="0" w:type="dxa"/>
-          </w:tblCellMar>
-        </w:tblPrEx>
         <w:trPr>
           <w:cantSplit/>
         </w:trPr>
@@ -2728,12 +2587,6 @@
         </w:tc>
       </w:tr>
       <w:tr>
-        <w:tblPrEx>
-          <w:tblCellMar>
-            <w:top w:w="0" w:type="dxa"/>
-            <w:bottom w:w="0" w:type="dxa"/>
-          </w:tblCellMar>
-        </w:tblPrEx>
         <w:trPr>
           <w:cantSplit/>
         </w:trPr>
@@ -2867,12 +2720,6 @@
         </w:tc>
       </w:tr>
       <w:tr>
-        <w:tblPrEx>
-          <w:tblCellMar>
-            <w:top w:w="0" w:type="dxa"/>
-            <w:bottom w:w="0" w:type="dxa"/>
-          </w:tblCellMar>
-        </w:tblPrEx>
         <w:trPr>
           <w:cantSplit/>
         </w:trPr>
@@ -3006,12 +2853,6 @@
         </w:tc>
       </w:tr>
       <w:tr>
-        <w:tblPrEx>
-          <w:tblCellMar>
-            <w:top w:w="0" w:type="dxa"/>
-            <w:bottom w:w="0" w:type="dxa"/>
-          </w:tblCellMar>
-        </w:tblPrEx>
         <w:trPr>
           <w:cantSplit/>
         </w:trPr>
@@ -3113,12 +2954,6 @@
         </w:tc>
       </w:tr>
       <w:tr>
-        <w:tblPrEx>
-          <w:tblCellMar>
-            <w:top w:w="0" w:type="dxa"/>
-            <w:bottom w:w="0" w:type="dxa"/>
-          </w:tblCellMar>
-        </w:tblPrEx>
         <w:trPr>
           <w:cantSplit/>
         </w:trPr>
@@ -3250,7 +3085,13 @@
         <w:spacing w:after="120"/>
       </w:pPr>
       <w:r>
-        <w:t>In practice there are two data sources. The drone sends a telemetry packet at every stop; the lab sends a results file after analysing the bottle. Both are shown below with the values from reading 2 in the mock data.</w:t>
+        <w:t xml:space="preserve">In practice there are two data sources. The drone sends a telemetry packet at every stop; the lab sends a results file after </w:t>
+      </w:r>
+      <w:r>
+        <w:t>analyzing</w:t>
+      </w:r>
+      <w:r>
+        <w:t xml:space="preserve"> the bottle. Both are shown below with the values from reading 2 in the mock data.</w:t>
       </w:r>
     </w:p>
     <w:p>
@@ -3748,12 +3589,6 @@
         <w:gridCol w:w="5060"/>
       </w:tblGrid>
       <w:tr>
-        <w:tblPrEx>
-          <w:tblCellMar>
-            <w:top w:w="0" w:type="dxa"/>
-            <w:bottom w:w="0" w:type="dxa"/>
-          </w:tblCellMar>
-        </w:tblPrEx>
         <w:trPr>
           <w:cantSplit/>
           <w:tblHeader/>
@@ -3824,12 +3659,6 @@
         </w:tc>
       </w:tr>
       <w:tr>
-        <w:tblPrEx>
-          <w:tblCellMar>
-            <w:top w:w="0" w:type="dxa"/>
-            <w:bottom w:w="0" w:type="dxa"/>
-          </w:tblCellMar>
-        </w:tblPrEx>
         <w:trPr>
           <w:cantSplit/>
         </w:trPr>
@@ -3904,12 +3733,6 @@
         </w:tc>
       </w:tr>
       <w:tr>
-        <w:tblPrEx>
-          <w:tblCellMar>
-            <w:top w:w="0" w:type="dxa"/>
-            <w:bottom w:w="0" w:type="dxa"/>
-          </w:tblCellMar>
-        </w:tblPrEx>
         <w:trPr>
           <w:cantSplit/>
         </w:trPr>
@@ -3984,12 +3807,6 @@
         </w:tc>
       </w:tr>
       <w:tr>
-        <w:tblPrEx>
-          <w:tblCellMar>
-            <w:top w:w="0" w:type="dxa"/>
-            <w:bottom w:w="0" w:type="dxa"/>
-          </w:tblCellMar>
-        </w:tblPrEx>
         <w:trPr>
           <w:cantSplit/>
         </w:trPr>
@@ -4071,12 +3888,6 @@
         </w:tc>
       </w:tr>
       <w:tr>
-        <w:tblPrEx>
-          <w:tblCellMar>
-            <w:top w:w="0" w:type="dxa"/>
-            <w:bottom w:w="0" w:type="dxa"/>
-          </w:tblCellMar>
-        </w:tblPrEx>
         <w:trPr>
           <w:cantSplit/>
         </w:trPr>
@@ -4231,12 +4042,6 @@
         </w:tc>
       </w:tr>
       <w:tr>
-        <w:tblPrEx>
-          <w:tblCellMar>
-            <w:top w:w="0" w:type="dxa"/>
-            <w:bottom w:w="0" w:type="dxa"/>
-          </w:tblCellMar>
-        </w:tblPrEx>
         <w:trPr>
           <w:cantSplit/>
         </w:trPr>
@@ -4311,12 +4116,6 @@
         </w:tc>
       </w:tr>
       <w:tr>
-        <w:tblPrEx>
-          <w:tblCellMar>
-            <w:top w:w="0" w:type="dxa"/>
-            <w:bottom w:w="0" w:type="dxa"/>
-          </w:tblCellMar>
-        </w:tblPrEx>
         <w:trPr>
           <w:cantSplit/>
         </w:trPr>
@@ -4732,12 +4531,6 @@
         <w:gridCol w:w="2598"/>
       </w:tblGrid>
       <w:tr>
-        <w:tblPrEx>
-          <w:tblCellMar>
-            <w:top w:w="0" w:type="dxa"/>
-            <w:bottom w:w="0" w:type="dxa"/>
-          </w:tblCellMar>
-        </w:tblPrEx>
         <w:trPr>
           <w:cantSplit/>
           <w:tblHeader/>
@@ -4904,12 +4697,6 @@
         </w:tc>
       </w:tr>
       <w:tr>
-        <w:tblPrEx>
-          <w:tblCellMar>
-            <w:top w:w="0" w:type="dxa"/>
-            <w:bottom w:w="0" w:type="dxa"/>
-          </w:tblCellMar>
-        </w:tblPrEx>
         <w:trPr>
           <w:cantSplit/>
         </w:trPr>
@@ -5056,18 +4843,26 @@
                 <w:sz w:val="16"/>
                 <w:szCs w:val="16"/>
               </w:rPr>
-              <w:t>A drone makes many runs; each run uses one drone.</w:t>
+              <w:t>A drone makes many runs</w:t>
+            </w:r>
+            <w:r>
+              <w:rPr>
+                <w:sz w:val="16"/>
+                <w:szCs w:val="16"/>
+              </w:rPr>
+              <w:t xml:space="preserve">, </w:t>
+            </w:r>
+            <w:r>
+              <w:rPr>
+                <w:sz w:val="16"/>
+                <w:szCs w:val="16"/>
+              </w:rPr>
+              <w:t>each run uses one drone.</w:t>
             </w:r>
           </w:p>
         </w:tc>
       </w:tr>
       <w:tr>
-        <w:tblPrEx>
-          <w:tblCellMar>
-            <w:top w:w="0" w:type="dxa"/>
-            <w:bottom w:w="0" w:type="dxa"/>
-          </w:tblCellMar>
-        </w:tblPrEx>
         <w:trPr>
           <w:cantSplit/>
         </w:trPr>
@@ -5220,12 +5015,6 @@
         </w:tc>
       </w:tr>
       <w:tr>
-        <w:tblPrEx>
-          <w:tblCellMar>
-            <w:top w:w="0" w:type="dxa"/>
-            <w:bottom w:w="0" w:type="dxa"/>
-          </w:tblCellMar>
-        </w:tblPrEx>
         <w:trPr>
           <w:cantSplit/>
         </w:trPr>
@@ -5394,12 +5183,6 @@
         </w:tc>
       </w:tr>
       <w:tr>
-        <w:tblPrEx>
-          <w:tblCellMar>
-            <w:top w:w="0" w:type="dxa"/>
-            <w:bottom w:w="0" w:type="dxa"/>
-          </w:tblCellMar>
-        </w:tblPrEx>
         <w:trPr>
           <w:cantSplit/>
         </w:trPr>
@@ -5552,12 +5335,6 @@
         </w:tc>
       </w:tr>
       <w:tr>
-        <w:tblPrEx>
-          <w:tblCellMar>
-            <w:top w:w="0" w:type="dxa"/>
-            <w:bottom w:w="0" w:type="dxa"/>
-          </w:tblCellMar>
-        </w:tblPrEx>
         <w:trPr>
           <w:cantSplit/>
         </w:trPr>
@@ -5717,12 +5494,6 @@
         </w:tc>
       </w:tr>
       <w:tr>
-        <w:tblPrEx>
-          <w:tblCellMar>
-            <w:top w:w="0" w:type="dxa"/>
-            <w:bottom w:w="0" w:type="dxa"/>
-          </w:tblCellMar>
-        </w:tblPrEx>
         <w:trPr>
           <w:cantSplit/>
         </w:trPr>
@@ -5875,12 +5646,6 @@
         </w:tc>
       </w:tr>
       <w:tr>
-        <w:tblPrEx>
-          <w:tblCellMar>
-            <w:top w:w="0" w:type="dxa"/>
-            <w:bottom w:w="0" w:type="dxa"/>
-          </w:tblCellMar>
-        </w:tblPrEx>
         <w:trPr>
           <w:cantSplit/>
         </w:trPr>
@@ -6033,12 +5798,6 @@
         </w:tc>
       </w:tr>
       <w:tr>
-        <w:tblPrEx>
-          <w:tblCellMar>
-            <w:top w:w="0" w:type="dxa"/>
-            <w:bottom w:w="0" w:type="dxa"/>
-          </w:tblCellMar>
-        </w:tblPrEx>
         <w:trPr>
           <w:cantSplit/>
         </w:trPr>
@@ -6268,12 +6027,6 @@
         <w:gridCol w:w="4460"/>
       </w:tblGrid>
       <w:tr>
-        <w:tblPrEx>
-          <w:tblCellMar>
-            <w:top w:w="0" w:type="dxa"/>
-            <w:bottom w:w="0" w:type="dxa"/>
-          </w:tblCellMar>
-        </w:tblPrEx>
         <w:trPr>
           <w:cantSplit/>
           <w:tblHeader/>
@@ -6408,12 +6161,6 @@
         </w:tc>
       </w:tr>
       <w:tr>
-        <w:tblPrEx>
-          <w:tblCellMar>
-            <w:top w:w="0" w:type="dxa"/>
-            <w:bottom w:w="0" w:type="dxa"/>
-          </w:tblCellMar>
-        </w:tblPrEx>
         <w:trPr>
           <w:cantSplit/>
         </w:trPr>
@@ -6535,12 +6282,6 @@
         </w:tc>
       </w:tr>
       <w:tr>
-        <w:tblPrEx>
-          <w:tblCellMar>
-            <w:top w:w="0" w:type="dxa"/>
-            <w:bottom w:w="0" w:type="dxa"/>
-          </w:tblCellMar>
-        </w:tblPrEx>
         <w:trPr>
           <w:cantSplit/>
         </w:trPr>
@@ -6655,12 +6396,6 @@
         </w:tc>
       </w:tr>
       <w:tr>
-        <w:tblPrEx>
-          <w:tblCellMar>
-            <w:top w:w="0" w:type="dxa"/>
-            <w:bottom w:w="0" w:type="dxa"/>
-          </w:tblCellMar>
-        </w:tblPrEx>
         <w:trPr>
           <w:cantSplit/>
         </w:trPr>
@@ -6775,12 +6510,6 @@
         </w:tc>
       </w:tr>
       <w:tr>
-        <w:tblPrEx>
-          <w:tblCellMar>
-            <w:top w:w="0" w:type="dxa"/>
-            <w:bottom w:w="0" w:type="dxa"/>
-          </w:tblCellMar>
-        </w:tblPrEx>
         <w:trPr>
           <w:cantSplit/>
         </w:trPr>
@@ -6928,12 +6657,6 @@
         <w:gridCol w:w="4460"/>
       </w:tblGrid>
       <w:tr>
-        <w:tblPrEx>
-          <w:tblCellMar>
-            <w:top w:w="0" w:type="dxa"/>
-            <w:bottom w:w="0" w:type="dxa"/>
-          </w:tblCellMar>
-        </w:tblPrEx>
         <w:trPr>
           <w:cantSplit/>
           <w:tblHeader/>
@@ -7068,12 +6791,6 @@
         </w:tc>
       </w:tr>
       <w:tr>
-        <w:tblPrEx>
-          <w:tblCellMar>
-            <w:top w:w="0" w:type="dxa"/>
-            <w:bottom w:w="0" w:type="dxa"/>
-          </w:tblCellMar>
-        </w:tblPrEx>
         <w:trPr>
           <w:cantSplit/>
         </w:trPr>
@@ -7195,12 +6912,6 @@
         </w:tc>
       </w:tr>
       <w:tr>
-        <w:tblPrEx>
-          <w:tblCellMar>
-            <w:top w:w="0" w:type="dxa"/>
-            <w:bottom w:w="0" w:type="dxa"/>
-          </w:tblCellMar>
-        </w:tblPrEx>
         <w:trPr>
           <w:cantSplit/>
         </w:trPr>
@@ -7348,12 +7059,6 @@
         <w:gridCol w:w="4460"/>
       </w:tblGrid>
       <w:tr>
-        <w:tblPrEx>
-          <w:tblCellMar>
-            <w:top w:w="0" w:type="dxa"/>
-            <w:bottom w:w="0" w:type="dxa"/>
-          </w:tblCellMar>
-        </w:tblPrEx>
         <w:trPr>
           <w:cantSplit/>
           <w:tblHeader/>
@@ -7488,12 +7193,6 @@
         </w:tc>
       </w:tr>
       <w:tr>
-        <w:tblPrEx>
-          <w:tblCellMar>
-            <w:top w:w="0" w:type="dxa"/>
-            <w:bottom w:w="0" w:type="dxa"/>
-          </w:tblCellMar>
-        </w:tblPrEx>
         <w:trPr>
           <w:cantSplit/>
         </w:trPr>
@@ -7615,12 +7314,6 @@
         </w:tc>
       </w:tr>
       <w:tr>
-        <w:tblPrEx>
-          <w:tblCellMar>
-            <w:top w:w="0" w:type="dxa"/>
-            <w:bottom w:w="0" w:type="dxa"/>
-          </w:tblCellMar>
-        </w:tblPrEx>
         <w:trPr>
           <w:cantSplit/>
         </w:trPr>
@@ -7742,12 +7435,6 @@
         </w:tc>
       </w:tr>
       <w:tr>
-        <w:tblPrEx>
-          <w:tblCellMar>
-            <w:top w:w="0" w:type="dxa"/>
-            <w:bottom w:w="0" w:type="dxa"/>
-          </w:tblCellMar>
-        </w:tblPrEx>
         <w:trPr>
           <w:cantSplit/>
         </w:trPr>
@@ -7862,12 +7549,6 @@
         </w:tc>
       </w:tr>
       <w:tr>
-        <w:tblPrEx>
-          <w:tblCellMar>
-            <w:top w:w="0" w:type="dxa"/>
-            <w:bottom w:w="0" w:type="dxa"/>
-          </w:tblCellMar>
-        </w:tblPrEx>
         <w:trPr>
           <w:cantSplit/>
         </w:trPr>
@@ -7982,12 +7663,6 @@
         </w:tc>
       </w:tr>
       <w:tr>
-        <w:tblPrEx>
-          <w:tblCellMar>
-            <w:top w:w="0" w:type="dxa"/>
-            <w:bottom w:w="0" w:type="dxa"/>
-          </w:tblCellMar>
-        </w:tblPrEx>
         <w:trPr>
           <w:cantSplit/>
         </w:trPr>
@@ -8103,12 +7778,6 @@
         </w:tc>
       </w:tr>
       <w:tr>
-        <w:tblPrEx>
-          <w:tblCellMar>
-            <w:top w:w="0" w:type="dxa"/>
-            <w:bottom w:w="0" w:type="dxa"/>
-          </w:tblCellMar>
-        </w:tblPrEx>
         <w:trPr>
           <w:cantSplit/>
         </w:trPr>
@@ -8217,7 +7886,21 @@
                 <w:sz w:val="16"/>
                 <w:szCs w:val="16"/>
               </w:rPr>
-              <w:t>Whole metres is enough for grouping near vs far.</w:t>
+              <w:t xml:space="preserve">Whole </w:t>
+            </w:r>
+            <w:r>
+              <w:rPr>
+                <w:sz w:val="16"/>
+                <w:szCs w:val="16"/>
+              </w:rPr>
+              <w:t>meters</w:t>
+            </w:r>
+            <w:r>
+              <w:rPr>
+                <w:sz w:val="16"/>
+                <w:szCs w:val="16"/>
+              </w:rPr>
+              <w:t xml:space="preserve"> is enough for grouping near vs far.</w:t>
             </w:r>
           </w:p>
         </w:tc>
@@ -8256,12 +7939,6 @@
         <w:gridCol w:w="4460"/>
       </w:tblGrid>
       <w:tr>
-        <w:tblPrEx>
-          <w:tblCellMar>
-            <w:top w:w="0" w:type="dxa"/>
-            <w:bottom w:w="0" w:type="dxa"/>
-          </w:tblCellMar>
-        </w:tblPrEx>
         <w:trPr>
           <w:cantSplit/>
           <w:tblHeader/>
@@ -8396,12 +8073,6 @@
         </w:tc>
       </w:tr>
       <w:tr>
-        <w:tblPrEx>
-          <w:tblCellMar>
-            <w:top w:w="0" w:type="dxa"/>
-            <w:bottom w:w="0" w:type="dxa"/>
-          </w:tblCellMar>
-        </w:tblPrEx>
         <w:trPr>
           <w:cantSplit/>
         </w:trPr>
@@ -8523,12 +8194,6 @@
         </w:tc>
       </w:tr>
       <w:tr>
-        <w:tblPrEx>
-          <w:tblCellMar>
-            <w:top w:w="0" w:type="dxa"/>
-            <w:bottom w:w="0" w:type="dxa"/>
-          </w:tblCellMar>
-        </w:tblPrEx>
         <w:trPr>
           <w:cantSplit/>
         </w:trPr>
@@ -8650,12 +8315,6 @@
         </w:tc>
       </w:tr>
       <w:tr>
-        <w:tblPrEx>
-          <w:tblCellMar>
-            <w:top w:w="0" w:type="dxa"/>
-            <w:bottom w:w="0" w:type="dxa"/>
-          </w:tblCellMar>
-        </w:tblPrEx>
         <w:trPr>
           <w:cantSplit/>
         </w:trPr>
@@ -8770,12 +8429,6 @@
         </w:tc>
       </w:tr>
       <w:tr>
-        <w:tblPrEx>
-          <w:tblCellMar>
-            <w:top w:w="0" w:type="dxa"/>
-            <w:bottom w:w="0" w:type="dxa"/>
-          </w:tblCellMar>
-        </w:tblPrEx>
         <w:trPr>
           <w:cantSplit/>
         </w:trPr>
@@ -8923,12 +8576,6 @@
         <w:gridCol w:w="4460"/>
       </w:tblGrid>
       <w:tr>
-        <w:tblPrEx>
-          <w:tblCellMar>
-            <w:top w:w="0" w:type="dxa"/>
-            <w:bottom w:w="0" w:type="dxa"/>
-          </w:tblCellMar>
-        </w:tblPrEx>
         <w:trPr>
           <w:cantSplit/>
           <w:tblHeader/>
@@ -9063,12 +8710,6 @@
         </w:tc>
       </w:tr>
       <w:tr>
-        <w:tblPrEx>
-          <w:tblCellMar>
-            <w:top w:w="0" w:type="dxa"/>
-            <w:bottom w:w="0" w:type="dxa"/>
-          </w:tblCellMar>
-        </w:tblPrEx>
         <w:trPr>
           <w:cantSplit/>
         </w:trPr>
@@ -9190,12 +8831,6 @@
         </w:tc>
       </w:tr>
       <w:tr>
-        <w:tblPrEx>
-          <w:tblCellMar>
-            <w:top w:w="0" w:type="dxa"/>
-            <w:bottom w:w="0" w:type="dxa"/>
-          </w:tblCellMar>
-        </w:tblPrEx>
         <w:trPr>
           <w:cantSplit/>
         </w:trPr>
@@ -9317,12 +8952,6 @@
         </w:tc>
       </w:tr>
       <w:tr>
-        <w:tblPrEx>
-          <w:tblCellMar>
-            <w:top w:w="0" w:type="dxa"/>
-            <w:bottom w:w="0" w:type="dxa"/>
-          </w:tblCellMar>
-        </w:tblPrEx>
         <w:trPr>
           <w:cantSplit/>
         </w:trPr>
@@ -9444,12 +9073,6 @@
         </w:tc>
       </w:tr>
       <w:tr>
-        <w:tblPrEx>
-          <w:tblCellMar>
-            <w:top w:w="0" w:type="dxa"/>
-            <w:bottom w:w="0" w:type="dxa"/>
-          </w:tblCellMar>
-        </w:tblPrEx>
         <w:trPr>
           <w:cantSplit/>
         </w:trPr>
@@ -9564,12 +9187,6 @@
         </w:tc>
       </w:tr>
       <w:tr>
-        <w:tblPrEx>
-          <w:tblCellMar>
-            <w:top w:w="0" w:type="dxa"/>
-            <w:bottom w:w="0" w:type="dxa"/>
-          </w:tblCellMar>
-        </w:tblPrEx>
         <w:trPr>
           <w:cantSplit/>
         </w:trPr>
@@ -9684,12 +9301,6 @@
         </w:tc>
       </w:tr>
       <w:tr>
-        <w:tblPrEx>
-          <w:tblCellMar>
-            <w:top w:w="0" w:type="dxa"/>
-            <w:bottom w:w="0" w:type="dxa"/>
-          </w:tblCellMar>
-        </w:tblPrEx>
         <w:trPr>
           <w:cantSplit/>
         </w:trPr>
@@ -9804,12 +9415,6 @@
         </w:tc>
       </w:tr>
       <w:tr>
-        <w:tblPrEx>
-          <w:tblCellMar>
-            <w:top w:w="0" w:type="dxa"/>
-            <w:bottom w:w="0" w:type="dxa"/>
-          </w:tblCellMar>
-        </w:tblPrEx>
         <w:trPr>
           <w:cantSplit/>
         </w:trPr>
@@ -9924,12 +9529,6 @@
         </w:tc>
       </w:tr>
       <w:tr>
-        <w:tblPrEx>
-          <w:tblCellMar>
-            <w:top w:w="0" w:type="dxa"/>
-            <w:bottom w:w="0" w:type="dxa"/>
-          </w:tblCellMar>
-        </w:tblPrEx>
         <w:trPr>
           <w:cantSplit/>
         </w:trPr>
@@ -10044,12 +9643,6 @@
         </w:tc>
       </w:tr>
       <w:tr>
-        <w:tblPrEx>
-          <w:tblCellMar>
-            <w:top w:w="0" w:type="dxa"/>
-            <w:bottom w:w="0" w:type="dxa"/>
-          </w:tblCellMar>
-        </w:tblPrEx>
         <w:trPr>
           <w:cantSplit/>
         </w:trPr>
@@ -10164,12 +9757,6 @@
         </w:tc>
       </w:tr>
       <w:tr>
-        <w:tblPrEx>
-          <w:tblCellMar>
-            <w:top w:w="0" w:type="dxa"/>
-            <w:bottom w:w="0" w:type="dxa"/>
-          </w:tblCellMar>
-        </w:tblPrEx>
         <w:trPr>
           <w:cantSplit/>
         </w:trPr>
@@ -10284,12 +9871,6 @@
         </w:tc>
       </w:tr>
       <w:tr>
-        <w:tblPrEx>
-          <w:tblCellMar>
-            <w:top w:w="0" w:type="dxa"/>
-            <w:bottom w:w="0" w:type="dxa"/>
-          </w:tblCellMar>
-        </w:tblPrEx>
         <w:trPr>
           <w:cantSplit/>
         </w:trPr>
@@ -10404,12 +9985,6 @@
         </w:tc>
       </w:tr>
       <w:tr>
-        <w:tblPrEx>
-          <w:tblCellMar>
-            <w:top w:w="0" w:type="dxa"/>
-            <w:bottom w:w="0" w:type="dxa"/>
-          </w:tblCellMar>
-        </w:tblPrEx>
         <w:trPr>
           <w:cantSplit/>
         </w:trPr>
@@ -10557,12 +10132,6 @@
         <w:gridCol w:w="4460"/>
       </w:tblGrid>
       <w:tr>
-        <w:tblPrEx>
-          <w:tblCellMar>
-            <w:top w:w="0" w:type="dxa"/>
-            <w:bottom w:w="0" w:type="dxa"/>
-          </w:tblCellMar>
-        </w:tblPrEx>
         <w:trPr>
           <w:cantSplit/>
           <w:tblHeader/>
@@ -10697,12 +10266,6 @@
         </w:tc>
       </w:tr>
       <w:tr>
-        <w:tblPrEx>
-          <w:tblCellMar>
-            <w:top w:w="0" w:type="dxa"/>
-            <w:bottom w:w="0" w:type="dxa"/>
-          </w:tblCellMar>
-        </w:tblPrEx>
         <w:trPr>
           <w:cantSplit/>
         </w:trPr>
@@ -10824,12 +10387,6 @@
         </w:tc>
       </w:tr>
       <w:tr>
-        <w:tblPrEx>
-          <w:tblCellMar>
-            <w:top w:w="0" w:type="dxa"/>
-            <w:bottom w:w="0" w:type="dxa"/>
-          </w:tblCellMar>
-        </w:tblPrEx>
         <w:trPr>
           <w:cantSplit/>
         </w:trPr>
@@ -10951,12 +10508,6 @@
         </w:tc>
       </w:tr>
       <w:tr>
-        <w:tblPrEx>
-          <w:tblCellMar>
-            <w:top w:w="0" w:type="dxa"/>
-            <w:bottom w:w="0" w:type="dxa"/>
-          </w:tblCellMar>
-        </w:tblPrEx>
         <w:trPr>
           <w:cantSplit/>
         </w:trPr>
@@ -11071,12 +10622,6 @@
         </w:tc>
       </w:tr>
       <w:tr>
-        <w:tblPrEx>
-          <w:tblCellMar>
-            <w:top w:w="0" w:type="dxa"/>
-            <w:bottom w:w="0" w:type="dxa"/>
-          </w:tblCellMar>
-        </w:tblPrEx>
         <w:trPr>
           <w:cantSplit/>
         </w:trPr>
@@ -11191,12 +10736,6 @@
         </w:tc>
       </w:tr>
       <w:tr>
-        <w:tblPrEx>
-          <w:tblCellMar>
-            <w:top w:w="0" w:type="dxa"/>
-            <w:bottom w:w="0" w:type="dxa"/>
-          </w:tblCellMar>
-        </w:tblPrEx>
         <w:trPr>
           <w:cantSplit/>
         </w:trPr>
@@ -11305,7 +10844,21 @@
                 <w:sz w:val="16"/>
                 <w:szCs w:val="16"/>
               </w:rPr>
-              <w:t>NULL until the lab has analysed it.</w:t>
+              <w:t xml:space="preserve">NULL until the lab has </w:t>
+            </w:r>
+            <w:r>
+              <w:rPr>
+                <w:sz w:val="16"/>
+                <w:szCs w:val="16"/>
+              </w:rPr>
+              <w:t>analyzed</w:t>
+            </w:r>
+            <w:r>
+              <w:rPr>
+                <w:sz w:val="16"/>
+                <w:szCs w:val="16"/>
+              </w:rPr>
+              <w:t xml:space="preserve"> it.</w:t>
             </w:r>
           </w:p>
         </w:tc>
@@ -11344,12 +10897,6 @@
         <w:gridCol w:w="4460"/>
       </w:tblGrid>
       <w:tr>
-        <w:tblPrEx>
-          <w:tblCellMar>
-            <w:top w:w="0" w:type="dxa"/>
-            <w:bottom w:w="0" w:type="dxa"/>
-          </w:tblCellMar>
-        </w:tblPrEx>
         <w:trPr>
           <w:cantSplit/>
           <w:tblHeader/>
@@ -11484,12 +11031,6 @@
         </w:tc>
       </w:tr>
       <w:tr>
-        <w:tblPrEx>
-          <w:tblCellMar>
-            <w:top w:w="0" w:type="dxa"/>
-            <w:bottom w:w="0" w:type="dxa"/>
-          </w:tblCellMar>
-        </w:tblPrEx>
         <w:trPr>
           <w:cantSplit/>
         </w:trPr>
@@ -11611,12 +11152,6 @@
         </w:tc>
       </w:tr>
       <w:tr>
-        <w:tblPrEx>
-          <w:tblCellMar>
-            <w:top w:w="0" w:type="dxa"/>
-            <w:bottom w:w="0" w:type="dxa"/>
-          </w:tblCellMar>
-        </w:tblPrEx>
         <w:trPr>
           <w:cantSplit/>
         </w:trPr>
@@ -11738,12 +11273,6 @@
         </w:tc>
       </w:tr>
       <w:tr>
-        <w:tblPrEx>
-          <w:tblCellMar>
-            <w:top w:w="0" w:type="dxa"/>
-            <w:bottom w:w="0" w:type="dxa"/>
-          </w:tblCellMar>
-        </w:tblPrEx>
         <w:trPr>
           <w:cantSplit/>
         </w:trPr>
@@ -11866,12 +11395,6 @@
         </w:tc>
       </w:tr>
       <w:tr>
-        <w:tblPrEx>
-          <w:tblCellMar>
-            <w:top w:w="0" w:type="dxa"/>
-            <w:bottom w:w="0" w:type="dxa"/>
-          </w:tblCellMar>
-        </w:tblPrEx>
         <w:trPr>
           <w:cantSplit/>
         </w:trPr>
@@ -11980,7 +11503,21 @@
                 <w:sz w:val="16"/>
                 <w:szCs w:val="16"/>
               </w:rPr>
-              <w:t>Where the plastic usually comes from; useful for the runoff discussion.</w:t>
+              <w:t>Where the plastic usually comes from</w:t>
+            </w:r>
+            <w:r>
+              <w:rPr>
+                <w:sz w:val="16"/>
+                <w:szCs w:val="16"/>
+              </w:rPr>
+              <w:t xml:space="preserve">, </w:t>
+            </w:r>
+            <w:r>
+              <w:rPr>
+                <w:sz w:val="16"/>
+                <w:szCs w:val="16"/>
+              </w:rPr>
+              <w:t>useful for the runoff discussion.</w:t>
             </w:r>
           </w:p>
         </w:tc>
@@ -12019,12 +11556,6 @@
         <w:gridCol w:w="4460"/>
       </w:tblGrid>
       <w:tr>
-        <w:tblPrEx>
-          <w:tblCellMar>
-            <w:top w:w="0" w:type="dxa"/>
-            <w:bottom w:w="0" w:type="dxa"/>
-          </w:tblCellMar>
-        </w:tblPrEx>
         <w:trPr>
           <w:cantSplit/>
           <w:tblHeader/>
@@ -12159,12 +11690,6 @@
         </w:tc>
       </w:tr>
       <w:tr>
-        <w:tblPrEx>
-          <w:tblCellMar>
-            <w:top w:w="0" w:type="dxa"/>
-            <w:bottom w:w="0" w:type="dxa"/>
-          </w:tblCellMar>
-        </w:tblPrEx>
         <w:trPr>
           <w:cantSplit/>
         </w:trPr>
@@ -12286,12 +11811,6 @@
         </w:tc>
       </w:tr>
       <w:tr>
-        <w:tblPrEx>
-          <w:tblCellMar>
-            <w:top w:w="0" w:type="dxa"/>
-            <w:bottom w:w="0" w:type="dxa"/>
-          </w:tblCellMar>
-        </w:tblPrEx>
         <w:trPr>
           <w:cantSplit/>
         </w:trPr>
@@ -12413,12 +11932,6 @@
         </w:tc>
       </w:tr>
       <w:tr>
-        <w:tblPrEx>
-          <w:tblCellMar>
-            <w:top w:w="0" w:type="dxa"/>
-            <w:bottom w:w="0" w:type="dxa"/>
-          </w:tblCellMar>
-        </w:tblPrEx>
         <w:trPr>
           <w:cantSplit/>
         </w:trPr>
@@ -12527,18 +12040,26 @@
                 <w:sz w:val="16"/>
                 <w:szCs w:val="16"/>
               </w:rPr>
-              <w:t>Whole particles; CHECK &gt;= 0.</w:t>
+              <w:t>Whole particles</w:t>
+            </w:r>
+            <w:r>
+              <w:rPr>
+                <w:sz w:val="16"/>
+                <w:szCs w:val="16"/>
+              </w:rPr>
+              <w:t>,</w:t>
+            </w:r>
+            <w:r>
+              <w:rPr>
+                <w:sz w:val="16"/>
+                <w:szCs w:val="16"/>
+              </w:rPr>
+              <w:t xml:space="preserve"> CHECK &gt;= 0.</w:t>
             </w:r>
           </w:p>
         </w:tc>
       </w:tr>
       <w:tr>
-        <w:tblPrEx>
-          <w:tblCellMar>
-            <w:top w:w="0" w:type="dxa"/>
-            <w:bottom w:w="0" w:type="dxa"/>
-          </w:tblCellMar>
-        </w:tblPrEx>
         <w:trPr>
           <w:cantSplit/>
         </w:trPr>
@@ -12653,12 +12174,6 @@
         </w:tc>
       </w:tr>
       <w:tr>
-        <w:tblPrEx>
-          <w:tblCellMar>
-            <w:top w:w="0" w:type="dxa"/>
-            <w:bottom w:w="0" w:type="dxa"/>
-          </w:tblCellMar>
-        </w:tblPrEx>
         <w:trPr>
           <w:cantSplit/>
         </w:trPr>
@@ -12814,12 +12329,6 @@
         <w:gridCol w:w="9360"/>
       </w:tblGrid>
       <w:tr>
-        <w:tblPrEx>
-          <w:tblCellMar>
-            <w:top w:w="0" w:type="dxa"/>
-            <w:bottom w:w="0" w:type="dxa"/>
-          </w:tblCellMar>
-        </w:tblPrEx>
         <w:tc>
           <w:tcPr>
             <w:tcW w:w="9360" w:type="dxa"/>
@@ -13128,12 +12637,6 @@
         <w:gridCol w:w="2260"/>
       </w:tblGrid>
       <w:tr>
-        <w:tblPrEx>
-          <w:tblCellMar>
-            <w:top w:w="0" w:type="dxa"/>
-            <w:bottom w:w="0" w:type="dxa"/>
-          </w:tblCellMar>
-        </w:tblPrEx>
         <w:trPr>
           <w:cantSplit/>
           <w:tblHeader/>
@@ -13268,12 +12771,6 @@
         </w:tc>
       </w:tr>
       <w:tr>
-        <w:tblPrEx>
-          <w:tblCellMar>
-            <w:top w:w="0" w:type="dxa"/>
-            <w:bottom w:w="0" w:type="dxa"/>
-          </w:tblCellMar>
-        </w:tblPrEx>
         <w:trPr>
           <w:cantSplit/>
         </w:trPr>
@@ -13397,12 +12894,6 @@
         </w:tc>
       </w:tr>
       <w:tr>
-        <w:tblPrEx>
-          <w:tblCellMar>
-            <w:top w:w="0" w:type="dxa"/>
-            <w:bottom w:w="0" w:type="dxa"/>
-          </w:tblCellMar>
-        </w:tblPrEx>
         <w:trPr>
           <w:cantSplit/>
         </w:trPr>
@@ -13530,12 +13021,6 @@
         </w:tc>
       </w:tr>
       <w:tr>
-        <w:tblPrEx>
-          <w:tblCellMar>
-            <w:top w:w="0" w:type="dxa"/>
-            <w:bottom w:w="0" w:type="dxa"/>
-          </w:tblCellMar>
-        </w:tblPrEx>
         <w:trPr>
           <w:cantSplit/>
         </w:trPr>
@@ -13659,12 +13144,6 @@
         </w:tc>
       </w:tr>
       <w:tr>
-        <w:tblPrEx>
-          <w:tblCellMar>
-            <w:top w:w="0" w:type="dxa"/>
-            <w:bottom w:w="0" w:type="dxa"/>
-          </w:tblCellMar>
-        </w:tblPrEx>
         <w:trPr>
           <w:cantSplit/>
         </w:trPr>
@@ -13792,12 +13271,6 @@
         </w:tc>
       </w:tr>
       <w:tr>
-        <w:tblPrEx>
-          <w:tblCellMar>
-            <w:top w:w="0" w:type="dxa"/>
-            <w:bottom w:w="0" w:type="dxa"/>
-          </w:tblCellMar>
-        </w:tblPrEx>
         <w:trPr>
           <w:cantSplit/>
         </w:trPr>
@@ -13921,12 +13394,6 @@
         </w:tc>
       </w:tr>
       <w:tr>
-        <w:tblPrEx>
-          <w:tblCellMar>
-            <w:top w:w="0" w:type="dxa"/>
-            <w:bottom w:w="0" w:type="dxa"/>
-          </w:tblCellMar>
-        </w:tblPrEx>
         <w:trPr>
           <w:cantSplit/>
         </w:trPr>
@@ -14055,12 +13522,6 @@
         </w:tc>
       </w:tr>
       <w:tr>
-        <w:tblPrEx>
-          <w:tblCellMar>
-            <w:top w:w="0" w:type="dxa"/>
-            <w:bottom w:w="0" w:type="dxa"/>
-          </w:tblCellMar>
-        </w:tblPrEx>
         <w:trPr>
           <w:cantSplit/>
         </w:trPr>
@@ -14184,12 +13645,6 @@
         </w:tc>
       </w:tr>
       <w:tr>
-        <w:tblPrEx>
-          <w:tblCellMar>
-            <w:top w:w="0" w:type="dxa"/>
-            <w:bottom w:w="0" w:type="dxa"/>
-          </w:tblCellMar>
-        </w:tblPrEx>
         <w:trPr>
           <w:cantSplit/>
         </w:trPr>
@@ -14317,12 +13772,6 @@
         </w:tc>
       </w:tr>
       <w:tr>
-        <w:tblPrEx>
-          <w:tblCellMar>
-            <w:top w:w="0" w:type="dxa"/>
-            <w:bottom w:w="0" w:type="dxa"/>
-          </w:tblCellMar>
-        </w:tblPrEx>
         <w:trPr>
           <w:cantSplit/>
         </w:trPr>
@@ -14446,12 +13895,6 @@
         </w:tc>
       </w:tr>
       <w:tr>
-        <w:tblPrEx>
-          <w:tblCellMar>
-            <w:top w:w="0" w:type="dxa"/>
-            <w:bottom w:w="0" w:type="dxa"/>
-          </w:tblCellMar>
-        </w:tblPrEx>
         <w:trPr>
           <w:cantSplit/>
         </w:trPr>
@@ -14579,12 +14022,6 @@
         </w:tc>
       </w:tr>
       <w:tr>
-        <w:tblPrEx>
-          <w:tblCellMar>
-            <w:top w:w="0" w:type="dxa"/>
-            <w:bottom w:w="0" w:type="dxa"/>
-          </w:tblCellMar>
-        </w:tblPrEx>
         <w:trPr>
           <w:cantSplit/>
         </w:trPr>
@@ -14708,12 +14145,6 @@
         </w:tc>
       </w:tr>
       <w:tr>
-        <w:tblPrEx>
-          <w:tblCellMar>
-            <w:top w:w="0" w:type="dxa"/>
-            <w:bottom w:w="0" w:type="dxa"/>
-          </w:tblCellMar>
-        </w:tblPrEx>
         <w:trPr>
           <w:cantSplit/>
         </w:trPr>
@@ -14841,12 +14272,6 @@
         </w:tc>
       </w:tr>
       <w:tr>
-        <w:tblPrEx>
-          <w:tblCellMar>
-            <w:top w:w="0" w:type="dxa"/>
-            <w:bottom w:w="0" w:type="dxa"/>
-          </w:tblCellMar>
-        </w:tblPrEx>
         <w:trPr>
           <w:cantSplit/>
         </w:trPr>
@@ -14970,12 +14395,6 @@
         </w:tc>
       </w:tr>
       <w:tr>
-        <w:tblPrEx>
-          <w:tblCellMar>
-            <w:top w:w="0" w:type="dxa"/>
-            <w:bottom w:w="0" w:type="dxa"/>
-          </w:tblCellMar>
-        </w:tblPrEx>
         <w:trPr>
           <w:cantSplit/>
         </w:trPr>
@@ -15149,12 +14568,6 @@
         <w:gridCol w:w="2360"/>
       </w:tblGrid>
       <w:tr>
-        <w:tblPrEx>
-          <w:tblCellMar>
-            <w:top w:w="0" w:type="dxa"/>
-            <w:bottom w:w="0" w:type="dxa"/>
-          </w:tblCellMar>
-        </w:tblPrEx>
         <w:trPr>
           <w:cantSplit/>
           <w:tblHeader/>
@@ -15289,12 +14702,6 @@
         </w:tc>
       </w:tr>
       <w:tr>
-        <w:tblPrEx>
-          <w:tblCellMar>
-            <w:top w:w="0" w:type="dxa"/>
-            <w:bottom w:w="0" w:type="dxa"/>
-          </w:tblCellMar>
-        </w:tblPrEx>
         <w:trPr>
           <w:cantSplit/>
         </w:trPr>
@@ -15416,12 +14823,6 @@
         </w:tc>
       </w:tr>
       <w:tr>
-        <w:tblPrEx>
-          <w:tblCellMar>
-            <w:top w:w="0" w:type="dxa"/>
-            <w:bottom w:w="0" w:type="dxa"/>
-          </w:tblCellMar>
-        </w:tblPrEx>
         <w:trPr>
           <w:cantSplit/>
         </w:trPr>
@@ -15547,12 +14948,6 @@
         </w:tc>
       </w:tr>
       <w:tr>
-        <w:tblPrEx>
-          <w:tblCellMar>
-            <w:top w:w="0" w:type="dxa"/>
-            <w:bottom w:w="0" w:type="dxa"/>
-          </w:tblCellMar>
-        </w:tblPrEx>
         <w:trPr>
           <w:cantSplit/>
         </w:trPr>
@@ -15674,12 +15069,6 @@
         </w:tc>
       </w:tr>
       <w:tr>
-        <w:tblPrEx>
-          <w:tblCellMar>
-            <w:top w:w="0" w:type="dxa"/>
-            <w:bottom w:w="0" w:type="dxa"/>
-          </w:tblCellMar>
-        </w:tblPrEx>
         <w:trPr>
           <w:cantSplit/>
         </w:trPr>
@@ -15805,12 +15194,6 @@
         </w:tc>
       </w:tr>
       <w:tr>
-        <w:tblPrEx>
-          <w:tblCellMar>
-            <w:top w:w="0" w:type="dxa"/>
-            <w:bottom w:w="0" w:type="dxa"/>
-          </w:tblCellMar>
-        </w:tblPrEx>
         <w:trPr>
           <w:cantSplit/>
         </w:trPr>
@@ -16167,12 +15550,6 @@
         <w:gridCol w:w="9360"/>
       </w:tblGrid>
       <w:tr>
-        <w:tblPrEx>
-          <w:tblCellMar>
-            <w:top w:w="0" w:type="dxa"/>
-            <w:bottom w:w="0" w:type="dxa"/>
-          </w:tblCellMar>
-        </w:tblPrEx>
         <w:tc>
           <w:tcPr>
             <w:tcW w:w="9360" w:type="dxa"/>
@@ -16431,12 +15808,6 @@
         <w:gridCol w:w="1865"/>
       </w:tblGrid>
       <w:tr>
-        <w:tblPrEx>
-          <w:tblCellMar>
-            <w:top w:w="0" w:type="dxa"/>
-            <w:bottom w:w="0" w:type="dxa"/>
-          </w:tblCellMar>
-        </w:tblPrEx>
         <w:trPr>
           <w:cantSplit/>
           <w:tblHeader/>
@@ -16603,12 +15974,6 @@
         </w:tc>
       </w:tr>
       <w:tr>
-        <w:tblPrEx>
-          <w:tblCellMar>
-            <w:top w:w="0" w:type="dxa"/>
-            <w:bottom w:w="0" w:type="dxa"/>
-          </w:tblCellMar>
-        </w:tblPrEx>
         <w:trPr>
           <w:cantSplit/>
         </w:trPr>
@@ -16759,12 +16124,6 @@
         </w:tc>
       </w:tr>
       <w:tr>
-        <w:tblPrEx>
-          <w:tblCellMar>
-            <w:top w:w="0" w:type="dxa"/>
-            <w:bottom w:w="0" w:type="dxa"/>
-          </w:tblCellMar>
-        </w:tblPrEx>
         <w:trPr>
           <w:cantSplit/>
         </w:trPr>
@@ -16920,12 +16279,6 @@
         </w:tc>
       </w:tr>
       <w:tr>
-        <w:tblPrEx>
-          <w:tblCellMar>
-            <w:top w:w="0" w:type="dxa"/>
-            <w:bottom w:w="0" w:type="dxa"/>
-          </w:tblCellMar>
-        </w:tblPrEx>
         <w:trPr>
           <w:cantSplit/>
         </w:trPr>
@@ -17076,12 +16429,6 @@
         </w:tc>
       </w:tr>
       <w:tr>
-        <w:tblPrEx>
-          <w:tblCellMar>
-            <w:top w:w="0" w:type="dxa"/>
-            <w:bottom w:w="0" w:type="dxa"/>
-          </w:tblCellMar>
-        </w:tblPrEx>
         <w:trPr>
           <w:cantSplit/>
         </w:trPr>
@@ -17237,12 +16584,6 @@
         </w:tc>
       </w:tr>
       <w:tr>
-        <w:tblPrEx>
-          <w:tblCellMar>
-            <w:top w:w="0" w:type="dxa"/>
-            <w:bottom w:w="0" w:type="dxa"/>
-          </w:tblCellMar>
-        </w:tblPrEx>
         <w:trPr>
           <w:cantSplit/>
         </w:trPr>
@@ -17393,12 +16734,6 @@
         </w:tc>
       </w:tr>
       <w:tr>
-        <w:tblPrEx>
-          <w:tblCellMar>
-            <w:top w:w="0" w:type="dxa"/>
-            <w:bottom w:w="0" w:type="dxa"/>
-          </w:tblCellMar>
-        </w:tblPrEx>
         <w:trPr>
           <w:cantSplit/>
         </w:trPr>
@@ -17554,12 +16889,6 @@
         </w:tc>
       </w:tr>
       <w:tr>
-        <w:tblPrEx>
-          <w:tblCellMar>
-            <w:top w:w="0" w:type="dxa"/>
-            <w:bottom w:w="0" w:type="dxa"/>
-          </w:tblCellMar>
-        </w:tblPrEx>
         <w:trPr>
           <w:cantSplit/>
         </w:trPr>
@@ -17710,12 +17039,6 @@
         </w:tc>
       </w:tr>
       <w:tr>
-        <w:tblPrEx>
-          <w:tblCellMar>
-            <w:top w:w="0" w:type="dxa"/>
-            <w:bottom w:w="0" w:type="dxa"/>
-          </w:tblCellMar>
-        </w:tblPrEx>
         <w:trPr>
           <w:cantSplit/>
         </w:trPr>
@@ -18056,12 +17379,6 @@
         <w:gridCol w:w="2340"/>
       </w:tblGrid>
       <w:tr>
-        <w:tblPrEx>
-          <w:tblCellMar>
-            <w:top w:w="0" w:type="dxa"/>
-            <w:bottom w:w="0" w:type="dxa"/>
-          </w:tblCellMar>
-        </w:tblPrEx>
         <w:trPr>
           <w:cantSplit/>
           <w:tblHeader/>
@@ -18196,12 +17513,6 @@
         </w:tc>
       </w:tr>
       <w:tr>
-        <w:tblPrEx>
-          <w:tblCellMar>
-            <w:top w:w="0" w:type="dxa"/>
-            <w:bottom w:w="0" w:type="dxa"/>
-          </w:tblCellMar>
-        </w:tblPrEx>
         <w:trPr>
           <w:cantSplit/>
         </w:trPr>
@@ -18323,12 +17634,6 @@
         </w:tc>
       </w:tr>
       <w:tr>
-        <w:tblPrEx>
-          <w:tblCellMar>
-            <w:top w:w="0" w:type="dxa"/>
-            <w:bottom w:w="0" w:type="dxa"/>
-          </w:tblCellMar>
-        </w:tblPrEx>
         <w:trPr>
           <w:cantSplit/>
         </w:trPr>
@@ -18454,12 +17759,6 @@
         </w:tc>
       </w:tr>
       <w:tr>
-        <w:tblPrEx>
-          <w:tblCellMar>
-            <w:top w:w="0" w:type="dxa"/>
-            <w:bottom w:w="0" w:type="dxa"/>
-          </w:tblCellMar>
-        </w:tblPrEx>
         <w:trPr>
           <w:cantSplit/>
         </w:trPr>
@@ -18581,12 +17880,6 @@
         </w:tc>
       </w:tr>
       <w:tr>
-        <w:tblPrEx>
-          <w:tblCellMar>
-            <w:top w:w="0" w:type="dxa"/>
-            <w:bottom w:w="0" w:type="dxa"/>
-          </w:tblCellMar>
-        </w:tblPrEx>
         <w:trPr>
           <w:cantSplit/>
         </w:trPr>
@@ -18712,12 +18005,6 @@
         </w:tc>
       </w:tr>
       <w:tr>
-        <w:tblPrEx>
-          <w:tblCellMar>
-            <w:top w:w="0" w:type="dxa"/>
-            <w:bottom w:w="0" w:type="dxa"/>
-          </w:tblCellMar>
-        </w:tblPrEx>
         <w:trPr>
           <w:cantSplit/>
         </w:trPr>
@@ -19042,12 +18329,6 @@
         <w:gridCol w:w="1560"/>
       </w:tblGrid>
       <w:tr>
-        <w:tblPrEx>
-          <w:tblCellMar>
-            <w:top w:w="0" w:type="dxa"/>
-            <w:bottom w:w="0" w:type="dxa"/>
-          </w:tblCellMar>
-        </w:tblPrEx>
         <w:trPr>
           <w:cantSplit/>
           <w:tblHeader/>
@@ -19246,12 +18527,6 @@
         </w:tc>
       </w:tr>
       <w:tr>
-        <w:tblPrEx>
-          <w:tblCellMar>
-            <w:top w:w="0" w:type="dxa"/>
-            <w:bottom w:w="0" w:type="dxa"/>
-          </w:tblCellMar>
-        </w:tblPrEx>
         <w:trPr>
           <w:cantSplit/>
         </w:trPr>
@@ -19431,12 +18706,6 @@
         </w:tc>
       </w:tr>
       <w:tr>
-        <w:tblPrEx>
-          <w:tblCellMar>
-            <w:top w:w="0" w:type="dxa"/>
-            <w:bottom w:w="0" w:type="dxa"/>
-          </w:tblCellMar>
-        </w:tblPrEx>
         <w:trPr>
           <w:cantSplit/>
         </w:trPr>
@@ -19772,12 +19041,6 @@
         <w:gridCol w:w="2340"/>
       </w:tblGrid>
       <w:tr>
-        <w:tblPrEx>
-          <w:tblCellMar>
-            <w:top w:w="0" w:type="dxa"/>
-            <w:bottom w:w="0" w:type="dxa"/>
-          </w:tblCellMar>
-        </w:tblPrEx>
         <w:trPr>
           <w:cantSplit/>
           <w:tblHeader/>
@@ -19912,12 +19175,6 @@
         </w:tc>
       </w:tr>
       <w:tr>
-        <w:tblPrEx>
-          <w:tblCellMar>
-            <w:top w:w="0" w:type="dxa"/>
-            <w:bottom w:w="0" w:type="dxa"/>
-          </w:tblCellMar>
-        </w:tblPrEx>
         <w:trPr>
           <w:cantSplit/>
         </w:trPr>
@@ -20337,12 +19594,6 @@
         <w:gridCol w:w="1872"/>
       </w:tblGrid>
       <w:tr>
-        <w:tblPrEx>
-          <w:tblCellMar>
-            <w:top w:w="0" w:type="dxa"/>
-            <w:bottom w:w="0" w:type="dxa"/>
-          </w:tblCellMar>
-        </w:tblPrEx>
         <w:trPr>
           <w:cantSplit/>
           <w:tblHeader/>
@@ -20509,12 +19760,6 @@
         </w:tc>
       </w:tr>
       <w:tr>
-        <w:tblPrEx>
-          <w:tblCellMar>
-            <w:top w:w="0" w:type="dxa"/>
-            <w:bottom w:w="0" w:type="dxa"/>
-          </w:tblCellMar>
-        </w:tblPrEx>
         <w:trPr>
           <w:cantSplit/>
         </w:trPr>
@@ -20665,12 +19910,6 @@
         </w:tc>
       </w:tr>
       <w:tr>
-        <w:tblPrEx>
-          <w:tblCellMar>
-            <w:top w:w="0" w:type="dxa"/>
-            <w:bottom w:w="0" w:type="dxa"/>
-          </w:tblCellMar>
-        </w:tblPrEx>
         <w:trPr>
           <w:cantSplit/>
         </w:trPr>
@@ -20998,12 +20237,6 @@
         <w:gridCol w:w="2340"/>
       </w:tblGrid>
       <w:tr>
-        <w:tblPrEx>
-          <w:tblCellMar>
-            <w:top w:w="0" w:type="dxa"/>
-            <w:bottom w:w="0" w:type="dxa"/>
-          </w:tblCellMar>
-        </w:tblPrEx>
         <w:trPr>
           <w:cantSplit/>
           <w:tblHeader/>
@@ -21139,12 +20372,6 @@
         </w:tc>
       </w:tr>
       <w:tr>
-        <w:tblPrEx>
-          <w:tblCellMar>
-            <w:top w:w="0" w:type="dxa"/>
-            <w:bottom w:w="0" w:type="dxa"/>
-          </w:tblCellMar>
-        </w:tblPrEx>
         <w:trPr>
           <w:cantSplit/>
         </w:trPr>
@@ -21511,12 +20738,6 @@
         <w:gridCol w:w="4680"/>
       </w:tblGrid>
       <w:tr>
-        <w:tblPrEx>
-          <w:tblCellMar>
-            <w:top w:w="0" w:type="dxa"/>
-            <w:bottom w:w="0" w:type="dxa"/>
-          </w:tblCellMar>
-        </w:tblPrEx>
         <w:trPr>
           <w:cantSplit/>
           <w:tblHeader/>
@@ -21587,12 +20808,6 @@
         </w:tc>
       </w:tr>
       <w:tr>
-        <w:tblPrEx>
-          <w:tblCellMar>
-            <w:top w:w="0" w:type="dxa"/>
-            <w:bottom w:w="0" w:type="dxa"/>
-          </w:tblCellMar>
-        </w:tblPrEx>
         <w:trPr>
           <w:cantSplit/>
         </w:trPr>
@@ -21656,12 +20871,6 @@
         </w:tc>
       </w:tr>
       <w:tr>
-        <w:tblPrEx>
-          <w:tblCellMar>
-            <w:top w:w="0" w:type="dxa"/>
-            <w:bottom w:w="0" w:type="dxa"/>
-          </w:tblCellMar>
-        </w:tblPrEx>
         <w:trPr>
           <w:cantSplit/>
         </w:trPr>
@@ -21727,12 +20936,6 @@
         </w:tc>
       </w:tr>
       <w:tr>
-        <w:tblPrEx>
-          <w:tblCellMar>
-            <w:top w:w="0" w:type="dxa"/>
-            <w:bottom w:w="0" w:type="dxa"/>
-          </w:tblCellMar>
-        </w:tblPrEx>
         <w:trPr>
           <w:cantSplit/>
         </w:trPr>
@@ -21796,12 +20999,6 @@
         </w:tc>
       </w:tr>
       <w:tr>
-        <w:tblPrEx>
-          <w:tblCellMar>
-            <w:top w:w="0" w:type="dxa"/>
-            <w:bottom w:w="0" w:type="dxa"/>
-          </w:tblCellMar>
-        </w:tblPrEx>
         <w:trPr>
           <w:cantSplit/>
         </w:trPr>
@@ -21893,12 +21090,6 @@
         <w:gridCol w:w="9360"/>
       </w:tblGrid>
       <w:tr>
-        <w:tblPrEx>
-          <w:tblCellMar>
-            <w:top w:w="0" w:type="dxa"/>
-            <w:bottom w:w="0" w:type="dxa"/>
-          </w:tblCellMar>
-        </w:tblPrEx>
         <w:tc>
           <w:tcPr>
             <w:tcW w:w="9360" w:type="dxa"/>
@@ -21963,7 +21154,21 @@
                 <w:sz w:val="19"/>
                 <w:szCs w:val="19"/>
               </w:rPr>
-              <w:t xml:space="preserve">Q3 shows average pH slightly lower on the second run. Two runs cannot establish a trend; use </w:t>
+              <w:t>Q3 shows average pH slightly lower on the second run. Two runs cannot establish a trend</w:t>
+            </w:r>
+            <w:r>
+              <w:rPr>
+                <w:sz w:val="19"/>
+                <w:szCs w:val="19"/>
+              </w:rPr>
+              <w:t xml:space="preserve">, </w:t>
+            </w:r>
+            <w:r>
+              <w:rPr>
+                <w:sz w:val="19"/>
+                <w:szCs w:val="19"/>
+              </w:rPr>
+              <w:t xml:space="preserve">use </w:t>
             </w:r>
             <w:r>
               <w:rPr>
@@ -22023,12 +21228,6 @@
         <w:gridCol w:w="6860"/>
       </w:tblGrid>
       <w:tr>
-        <w:tblPrEx>
-          <w:tblCellMar>
-            <w:top w:w="0" w:type="dxa"/>
-            <w:bottom w:w="0" w:type="dxa"/>
-          </w:tblCellMar>
-        </w:tblPrEx>
         <w:trPr>
           <w:cantSplit/>
           <w:tblHeader/>
@@ -22131,12 +21330,6 @@
         </w:tc>
       </w:tr>
       <w:tr>
-        <w:tblPrEx>
-          <w:tblCellMar>
-            <w:top w:w="0" w:type="dxa"/>
-            <w:bottom w:w="0" w:type="dxa"/>
-          </w:tblCellMar>
-        </w:tblPrEx>
         <w:trPr>
           <w:cantSplit/>
         </w:trPr>
@@ -22229,12 +21422,6 @@
         </w:tc>
       </w:tr>
       <w:tr>
-        <w:tblPrEx>
-          <w:tblCellMar>
-            <w:top w:w="0" w:type="dxa"/>
-            <w:bottom w:w="0" w:type="dxa"/>
-          </w:tblCellMar>
-        </w:tblPrEx>
         <w:trPr>
           <w:cantSplit/>
         </w:trPr>
@@ -22321,32 +21508,19 @@
                 <w:sz w:val="17"/>
                 <w:szCs w:val="17"/>
               </w:rPr>
-              <w:t>Project: data to be captured, sources (drone, sensors, lab), method of obtaining the data, and the questions with the SDG 14 target each supports</w:t>
+              <w:t>Project: data to be captured, sources (drone, sensors, lab), method of obtaining the data, and the questions with the SDG 14 target each supports. Show the corrected raw-data example</w:t>
             </w:r>
             <w:r>
               <w:rPr>
                 <w:sz w:val="17"/>
                 <w:szCs w:val="17"/>
               </w:rPr>
-              <w:t>. Show the corrected raw-data example</w:t>
-            </w:r>
-            <w:r>
-              <w:rPr>
-                <w:sz w:val="17"/>
-                <w:szCs w:val="17"/>
-              </w:rPr>
               <w:t>.</w:t>
             </w:r>
           </w:p>
         </w:tc>
       </w:tr>
       <w:tr>
-        <w:tblPrEx>
-          <w:tblCellMar>
-            <w:top w:w="0" w:type="dxa"/>
-            <w:bottom w:w="0" w:type="dxa"/>
-          </w:tblCellMar>
-        </w:tblPrEx>
         <w:trPr>
           <w:cantSplit/>
         </w:trPr>
@@ -22439,12 +21613,6 @@
         </w:tc>
       </w:tr>
       <w:tr>
-        <w:tblPrEx>
-          <w:tblCellMar>
-            <w:top w:w="0" w:type="dxa"/>
-            <w:bottom w:w="0" w:type="dxa"/>
-          </w:tblCellMar>
-        </w:tblPrEx>
         <w:trPr>
           <w:cantSplit/>
         </w:trPr>
@@ -22574,12 +21742,6 @@
         <w:gridCol w:w="6360"/>
       </w:tblGrid>
       <w:tr>
-        <w:tblPrEx>
-          <w:tblCellMar>
-            <w:top w:w="0" w:type="dxa"/>
-            <w:bottom w:w="0" w:type="dxa"/>
-          </w:tblCellMar>
-        </w:tblPrEx>
         <w:trPr>
           <w:cantSplit/>
           <w:tblHeader/>
@@ -22650,12 +21812,6 @@
         </w:tc>
       </w:tr>
       <w:tr>
-        <w:tblPrEx>
-          <w:tblCellMar>
-            <w:top w:w="0" w:type="dxa"/>
-            <w:bottom w:w="0" w:type="dxa"/>
-          </w:tblCellMar>
-        </w:tblPrEx>
         <w:trPr>
           <w:cantSplit/>
         </w:trPr>
@@ -22735,12 +21891,6 @@
         </w:tc>
       </w:tr>
       <w:tr>
-        <w:tblPrEx>
-          <w:tblCellMar>
-            <w:top w:w="0" w:type="dxa"/>
-            <w:bottom w:w="0" w:type="dxa"/>
-          </w:tblCellMar>
-        </w:tblPrEx>
         <w:trPr>
           <w:cantSplit/>
         </w:trPr>
@@ -22836,12 +21986,6 @@
         </w:tc>
       </w:tr>
       <w:tr>
-        <w:tblPrEx>
-          <w:tblCellMar>
-            <w:top w:w="0" w:type="dxa"/>
-            <w:bottom w:w="0" w:type="dxa"/>
-          </w:tblCellMar>
-        </w:tblPrEx>
         <w:trPr>
           <w:cantSplit/>
         </w:trPr>
@@ -22905,12 +22049,6 @@
         </w:tc>
       </w:tr>
       <w:tr>
-        <w:tblPrEx>
-          <w:tblCellMar>
-            <w:top w:w="0" w:type="dxa"/>
-            <w:bottom w:w="0" w:type="dxa"/>
-          </w:tblCellMar>
-        </w:tblPrEx>
         <w:trPr>
           <w:cantSplit/>
         </w:trPr>
@@ -22990,12 +22128,6 @@
         </w:tc>
       </w:tr>
       <w:tr>
-        <w:tblPrEx>
-          <w:tblCellMar>
-            <w:top w:w="0" w:type="dxa"/>
-            <w:bottom w:w="0" w:type="dxa"/>
-          </w:tblCellMar>
-        </w:tblPrEx>
         <w:trPr>
           <w:cantSplit/>
         </w:trPr>
@@ -23075,12 +22207,6 @@
         </w:tc>
       </w:tr>
       <w:tr>
-        <w:tblPrEx>
-          <w:tblCellMar>
-            <w:top w:w="0" w:type="dxa"/>
-            <w:bottom w:w="0" w:type="dxa"/>
-          </w:tblCellMar>
-        </w:tblPrEx>
         <w:trPr>
           <w:cantSplit/>
         </w:trPr>
@@ -23144,12 +22270,6 @@
         </w:tc>
       </w:tr>
       <w:tr>
-        <w:tblPrEx>
-          <w:tblCellMar>
-            <w:top w:w="0" w:type="dxa"/>
-            <w:bottom w:w="0" w:type="dxa"/>
-          </w:tblCellMar>
-        </w:tblPrEx>
         <w:trPr>
           <w:cantSplit/>
         </w:trPr>
@@ -23259,12 +22379,6 @@
         <w:gridCol w:w="3660"/>
       </w:tblGrid>
       <w:tr>
-        <w:tblPrEx>
-          <w:tblCellMar>
-            <w:top w:w="0" w:type="dxa"/>
-            <w:bottom w:w="0" w:type="dxa"/>
-          </w:tblCellMar>
-        </w:tblPrEx>
         <w:trPr>
           <w:cantSplit/>
           <w:tblHeader/>
@@ -23399,12 +22513,6 @@
         </w:tc>
       </w:tr>
       <w:tr>
-        <w:tblPrEx>
-          <w:tblCellMar>
-            <w:top w:w="0" w:type="dxa"/>
-            <w:bottom w:w="0" w:type="dxa"/>
-          </w:tblCellMar>
-        </w:tblPrEx>
         <w:trPr>
           <w:cantSplit/>
         </w:trPr>
@@ -23498,12 +22606,6 @@
         </w:tc>
       </w:tr>
       <w:tr>
-        <w:tblPrEx>
-          <w:tblCellMar>
-            <w:top w:w="0" w:type="dxa"/>
-            <w:bottom w:w="0" w:type="dxa"/>
-          </w:tblCellMar>
-        </w:tblPrEx>
         <w:trPr>
           <w:cantSplit/>
         </w:trPr>
@@ -23597,12 +22699,6 @@
         </w:tc>
       </w:tr>
       <w:tr>
-        <w:tblPrEx>
-          <w:tblCellMar>
-            <w:top w:w="0" w:type="dxa"/>
-            <w:bottom w:w="0" w:type="dxa"/>
-          </w:tblCellMar>
-        </w:tblPrEx>
         <w:trPr>
           <w:cantSplit/>
         </w:trPr>
@@ -24102,7 +23198,19 @@
         <w:spacing w:after="120"/>
       </w:pPr>
       <w:r>
-        <w:t>Check the repository is accessible to your instructor (</w:t>
+        <w:t>Check the repository is accessible</w:t>
+      </w:r>
+      <w:r>
+        <w:t xml:space="preserve"> to</w:t>
+      </w:r>
+      <w:r>
+        <w:t xml:space="preserve"> </w:t>
+      </w:r>
+      <w:r>
+        <w:t>professor</w:t>
+      </w:r>
+      <w:r>
+        <w:t xml:space="preserve"> (</w:t>
       </w:r>
       <w:r>
         <w:t>collaborator invite) before the due date.</w:t>

</xml_diff>